<commit_message>
docs: remove Copilot practice exam page and renumber references
</commit_message>
<xml_diff>
--- a/courseware/LP-Enhance Work Productivity with Microsoft 365 Copilot.docx
+++ b/courseware/LP-Enhance Work Productivity with Microsoft 365 Copilot.docx
@@ -924,7 +924,7 @@
                 <w:b w:val="0"/>
                 <w:sz w:val="17"/>
               </w:rPr>
-              <w:t>Slides 19-45</w:t>
+              <w:t>Slides 18-44</w:t>
             </w:r>
           </w:p>
         </w:tc>
@@ -1083,7 +1083,7 @@
                 <w:b w:val="0"/>
                 <w:sz w:val="17"/>
               </w:rPr>
-              <w:t>Slides 35-40</w:t>
+              <w:t>Slides 34-39</w:t>
             </w:r>
           </w:p>
         </w:tc>
@@ -1242,7 +1242,7 @@
                 <w:b w:val="0"/>
                 <w:sz w:val="17"/>
               </w:rPr>
-              <w:t>Slides 19-45</w:t>
+              <w:t>Slides 18-44</w:t>
             </w:r>
           </w:p>
         </w:tc>
@@ -1319,7 +1319,7 @@
                 <w:b w:val="0"/>
                 <w:sz w:val="17"/>
               </w:rPr>
-              <w:t>Slides 41-44</w:t>
+              <w:t>Slides 40-43</w:t>
             </w:r>
           </w:p>
         </w:tc>
@@ -1478,7 +1478,7 @@
                 <w:b w:val="0"/>
                 <w:sz w:val="17"/>
               </w:rPr>
-              <w:t>Slides 46-68</w:t>
+              <w:t>Slides 45-67</w:t>
             </w:r>
           </w:p>
         </w:tc>
@@ -1555,7 +1555,7 @@
                 <w:b w:val="0"/>
                 <w:sz w:val="17"/>
               </w:rPr>
-              <w:t>Slides 62-67</w:t>
+              <w:t>Slides 61-66</w:t>
             </w:r>
           </w:p>
         </w:tc>
@@ -1915,7 +1915,7 @@
                 <w:b w:val="0"/>
                 <w:sz w:val="17"/>
               </w:rPr>
-              <w:t>Slides 70-92</w:t>
+              <w:t>Slides 69-91</w:t>
             </w:r>
           </w:p>
         </w:tc>
@@ -2074,7 +2074,7 @@
                 <w:b w:val="0"/>
                 <w:sz w:val="17"/>
               </w:rPr>
-              <w:t>Slides 86-91</w:t>
+              <w:t>Slides 85-90</w:t>
             </w:r>
           </w:p>
         </w:tc>
@@ -2151,7 +2151,7 @@
                 <w:b w:val="0"/>
                 <w:sz w:val="17"/>
               </w:rPr>
-              <w:t>Slides 94-120</w:t>
+              <w:t>Slides 93-119</w:t>
             </w:r>
           </w:p>
         </w:tc>
@@ -2310,7 +2310,7 @@
                 <w:b w:val="0"/>
                 <w:sz w:val="17"/>
               </w:rPr>
-              <w:t>Slides 94-120</w:t>
+              <w:t>Slides 93-119</w:t>
             </w:r>
           </w:p>
         </w:tc>
@@ -2387,7 +2387,7 @@
                 <w:b w:val="0"/>
                 <w:sz w:val="17"/>
               </w:rPr>
-              <w:t>Slides 110-119</w:t>
+              <w:t>Slides 109-118</w:t>
             </w:r>
           </w:p>
         </w:tc>
@@ -2661,7 +2661,7 @@
         <w:pStyle w:val="Heading2"/>
       </w:pPr>
       <w:r>
-        <w:t>Topic 01: Microsoft 365 Copilot Foundations, Word and PowerPoint · Slides 19-45</w:t>
+        <w:t>Topic 01: Microsoft 365 Copilot Foundations, Word and PowerPoint · Slides 18-44</w:t>
       </w:r>
     </w:p>
     <w:p>
@@ -2758,7 +2758,7 @@
         <w:pStyle w:val="Heading3"/>
       </w:pPr>
       <w:r>
-        <w:t>Lab 01: Set Up Microsoft 365 Copilot and Prompt Safely · Slides 35-36</w:t>
+        <w:t>Lab 01: Set Up Microsoft 365 Copilot and Prompt Safely · Slides 34-35</w:t>
       </w:r>
     </w:p>
     <w:p>
@@ -2771,7 +2771,7 @@
         <w:pStyle w:val="Heading3"/>
       </w:pPr>
       <w:r>
-        <w:t>Lab 02: Draft a Project Brief in Word from Excel Evidence · Slides 37-38</w:t>
+        <w:t>Lab 02: Draft a Project Brief in Word from Excel Evidence · Slides 36-37</w:t>
       </w:r>
     </w:p>
     <w:p>
@@ -2784,7 +2784,7 @@
         <w:pStyle w:val="Heading3"/>
       </w:pPr>
       <w:r>
-        <w:t>Lab 03: Refine a Responsible Copilot Use Policy in Word · Slides 39-40</w:t>
+        <w:t>Lab 03: Refine a Responsible Copilot Use Policy in Word · Slides 38-39</w:t>
       </w:r>
     </w:p>
     <w:p>
@@ -2797,7 +2797,7 @@
         <w:pStyle w:val="Heading3"/>
       </w:pPr>
       <w:r>
-        <w:t>Lab 04: Build a PowerPoint Story from Word and Excel · Slides 41-42</w:t>
+        <w:t>Lab 04: Build a PowerPoint Story from Word and Excel · Slides 40-41</w:t>
       </w:r>
     </w:p>
     <w:p>
@@ -2810,7 +2810,7 @@
         <w:pStyle w:val="Heading3"/>
       </w:pPr>
       <w:r>
-        <w:t>Lab 05: Enhance PowerPoint with Native Charts and Speaker Notes · Slides 43-44</w:t>
+        <w:t>Lab 05: Enhance PowerPoint with Native Charts and Speaker Notes · Slides 42-43</w:t>
       </w:r>
     </w:p>
     <w:p>
@@ -2823,7 +2823,7 @@
         <w:pStyle w:val="Heading2"/>
       </w:pPr>
       <w:r>
-        <w:t>Topic 02: Copilot for Excel: From Questions to Deep Analysis · Slides 46-68</w:t>
+        <w:t>Topic 02: Copilot for Excel: From Questions to Deep Analysis · Slides 45-67</w:t>
       </w:r>
     </w:p>
     <w:p>
@@ -2920,7 +2920,7 @@
         <w:pStyle w:val="Heading3"/>
       </w:pPr>
       <w:r>
-        <w:t>Lab 06: Build and Audit Excel Formulas with Copilot · Slides 62-63</w:t>
+        <w:t>Lab 06: Build and Audit Excel Formulas with Copilot · Slides 61-62</w:t>
       </w:r>
     </w:p>
     <w:p>
@@ -2933,7 +2933,7 @@
         <w:pStyle w:val="Heading3"/>
       </w:pPr>
       <w:r>
-        <w:t>Lab 07: Run Deep Descriptive and Diagnostic Analysis in Excel · Slides 64-65</w:t>
+        <w:t>Lab 07: Run Deep Descriptive and Diagnostic Analysis in Excel · Slides 63-64</w:t>
       </w:r>
     </w:p>
     <w:p>
@@ -2946,7 +2946,7 @@
         <w:pStyle w:val="Heading3"/>
       </w:pPr>
       <w:r>
-        <w:t>Lab 08: Forecast and Stress-Test a Campaign with Copilot · Slides 66-67</w:t>
+        <w:t>Lab 08: Forecast and Stress-Test a Campaign with Copilot · Slides 65-66</w:t>
       </w:r>
     </w:p>
     <w:p>
@@ -2959,7 +2959,7 @@
         <w:pStyle w:val="Heading2"/>
       </w:pPr>
       <w:r>
-        <w:t>Topic 03: Copilot for Outlook, Teams and Loop · Slides 70-92</w:t>
+        <w:t>Topic 03: Copilot for Outlook, Teams and Loop · Slides 69-91</w:t>
       </w:r>
     </w:p>
     <w:p>
@@ -3056,7 +3056,7 @@
         <w:pStyle w:val="Heading3"/>
       </w:pPr>
       <w:r>
-        <w:t>Lab 09: Triage an Outlook Inbox and Draft a Controlled Reply · Slides 86-87</w:t>
+        <w:t>Lab 09: Triage an Outlook Inbox and Draft a Controlled Reply · Slides 85-86</w:t>
       </w:r>
     </w:p>
     <w:p>
@@ -3069,7 +3069,7 @@
         <w:pStyle w:val="Heading3"/>
       </w:pPr>
       <w:r>
-        <w:t>Lab 10: Run an Action-Oriented Teams Meeting · Slides 88-89</w:t>
+        <w:t>Lab 10: Run an Action-Oriented Teams Meeting · Slides 87-88</w:t>
       </w:r>
     </w:p>
     <w:p>
@@ -3082,7 +3082,7 @@
         <w:pStyle w:val="Heading3"/>
       </w:pPr>
       <w:r>
-        <w:t>Lab 11: Build a Living Implementation and Training Plan in Loop · Slides 90-91</w:t>
+        <w:t>Lab 11: Build a Living Implementation and Training Plan in Loop · Slides 89-90</w:t>
       </w:r>
     </w:p>
     <w:p>
@@ -3095,7 +3095,7 @@
         <w:pStyle w:val="Heading2"/>
       </w:pPr>
       <w:r>
-        <w:t>Topic 04: Microsoft 365 Copilot Agents and Governed Pipelines · Slides 94-120</w:t>
+        <w:t>Topic 04: Microsoft 365 Copilot Agents and Governed Pipelines · Slides 93-119</w:t>
       </w:r>
     </w:p>
     <w:p>
@@ -3192,7 +3192,7 @@
         <w:pStyle w:val="Heading3"/>
       </w:pPr>
       <w:r>
-        <w:t>Lab 12: Design a Scoped Microsoft 365 Copilot Agent · Slides 110-111</w:t>
+        <w:t>Lab 12: Design a Scoped Microsoft 365 Copilot Agent · Slides 109-110</w:t>
       </w:r>
     </w:p>
     <w:p>
@@ -3205,7 +3205,7 @@
         <w:pStyle w:val="Heading3"/>
       </w:pPr>
       <w:r>
-        <w:t>Lab 13: Build an Intake and Routing Agent · Slides 112-113</w:t>
+        <w:t>Lab 13: Build an Intake and Routing Agent · Slides 111-112</w:t>
       </w:r>
     </w:p>
     <w:p>
@@ -3218,7 +3218,7 @@
         <w:pStyle w:val="Heading3"/>
       </w:pPr>
       <w:r>
-        <w:t>Lab 14: Connect an Agent to a Controlled Action · Slides 114-115</w:t>
+        <w:t>Lab 14: Connect an Agent to a Controlled Action · Slides 113-114</w:t>
       </w:r>
     </w:p>
     <w:p>
@@ -3231,7 +3231,7 @@
         <w:pStyle w:val="Heading3"/>
       </w:pPr>
       <w:r>
-        <w:t>Lab 15: Create an Analysis-to-Deck Agent Pipeline · Slides 116-117</w:t>
+        <w:t>Lab 15: Create an Analysis-to-Deck Agent Pipeline · Slides 115-116</w:t>
       </w:r>
     </w:p>
     <w:p>
@@ -3244,7 +3244,7 @@
         <w:pStyle w:val="Heading3"/>
       </w:pPr>
       <w:r>
-        <w:t>Lab 16: Operate a Governed End-to-End Copilot Pipeline · Slides 118-119</w:t>
+        <w:t>Lab 16: Operate a Governed End-to-End Copilot Pipeline · Slides 117-118</w:t>
       </w:r>
     </w:p>
     <w:p>
@@ -3593,7 +3593,7 @@
     </w:p>
     <w:p>
       <w:r>
-        <w:t>Extension slide range: 121–133. All original slide content is retained.</w:t>
+        <w:t>Extension slide range: 120–132. All other slide content is retained; the practice-exam page was removed.</w:t>
       </w:r>
     </w:p>
     <w:sectPr>

</xml_diff>

<commit_message>
docs: remove tea-break slide and retain lunch break
</commit_message>
<xml_diff>
--- a/courseware/LP-Enhance Work Productivity with Microsoft 365 Copilot.docx
+++ b/courseware/LP-Enhance Work Productivity with Microsoft 365 Copilot.docx
@@ -924,7 +924,7 @@
                 <w:b w:val="0"/>
                 <w:sz w:val="17"/>
               </w:rPr>
-              <w:t>Slides 18-44</w:t>
+              <w:t>Slides 17-43</w:t>
             </w:r>
           </w:p>
         </w:tc>
@@ -1083,7 +1083,7 @@
                 <w:b w:val="0"/>
                 <w:sz w:val="17"/>
               </w:rPr>
-              <w:t>Slides 34-39</w:t>
+              <w:t>Slides 33-38</w:t>
             </w:r>
           </w:p>
         </w:tc>
@@ -1242,7 +1242,7 @@
                 <w:b w:val="0"/>
                 <w:sz w:val="17"/>
               </w:rPr>
-              <w:t>Slides 18-44</w:t>
+              <w:t>Slides 17-43</w:t>
             </w:r>
           </w:p>
         </w:tc>
@@ -1319,7 +1319,7 @@
                 <w:b w:val="0"/>
                 <w:sz w:val="17"/>
               </w:rPr>
-              <w:t>Slides 40-43</w:t>
+              <w:t>Slides 39-42</w:t>
             </w:r>
           </w:p>
         </w:tc>
@@ -1478,7 +1478,7 @@
                 <w:b w:val="0"/>
                 <w:sz w:val="17"/>
               </w:rPr>
-              <w:t>Slides 45-67</w:t>
+              <w:t>Slides 44-66</w:t>
             </w:r>
           </w:p>
         </w:tc>
@@ -1555,7 +1555,7 @@
                 <w:b w:val="0"/>
                 <w:sz w:val="17"/>
               </w:rPr>
-              <w:t>Slides 61-66</w:t>
+              <w:t>Slides 60-65</w:t>
             </w:r>
           </w:p>
         </w:tc>
@@ -1915,7 +1915,7 @@
                 <w:b w:val="0"/>
                 <w:sz w:val="17"/>
               </w:rPr>
-              <w:t>Slides 69-91</w:t>
+              <w:t>Slides 68-90</w:t>
             </w:r>
           </w:p>
         </w:tc>
@@ -2074,7 +2074,7 @@
                 <w:b w:val="0"/>
                 <w:sz w:val="17"/>
               </w:rPr>
-              <w:t>Slides 85-90</w:t>
+              <w:t>Slides 84-89</w:t>
             </w:r>
           </w:p>
         </w:tc>
@@ -2151,7 +2151,7 @@
                 <w:b w:val="0"/>
                 <w:sz w:val="17"/>
               </w:rPr>
-              <w:t>Slides 93-119</w:t>
+              <w:t>Slides 92-118</w:t>
             </w:r>
           </w:p>
         </w:tc>
@@ -2310,7 +2310,7 @@
                 <w:b w:val="0"/>
                 <w:sz w:val="17"/>
               </w:rPr>
-              <w:t>Slides 93-119</w:t>
+              <w:t>Slides 92-118</w:t>
             </w:r>
           </w:p>
         </w:tc>
@@ -2387,7 +2387,7 @@
                 <w:b w:val="0"/>
                 <w:sz w:val="17"/>
               </w:rPr>
-              <w:t>Slides 109-118</w:t>
+              <w:t>Slides 108-117</w:t>
             </w:r>
           </w:p>
         </w:tc>
@@ -2661,7 +2661,7 @@
         <w:pStyle w:val="Heading2"/>
       </w:pPr>
       <w:r>
-        <w:t>Topic 01: Microsoft 365 Copilot Foundations, Word and PowerPoint · Slides 18-44</w:t>
+        <w:t>Topic 01: Microsoft 365 Copilot Foundations, Word and PowerPoint · Slides 17-43</w:t>
       </w:r>
     </w:p>
     <w:p>
@@ -2758,7 +2758,7 @@
         <w:pStyle w:val="Heading3"/>
       </w:pPr>
       <w:r>
-        <w:t>Lab 01: Set Up Microsoft 365 Copilot and Prompt Safely · Slides 34-35</w:t>
+        <w:t>Lab 01: Set Up Microsoft 365 Copilot and Prompt Safely · Slides 33-34</w:t>
       </w:r>
     </w:p>
     <w:p>
@@ -2771,7 +2771,7 @@
         <w:pStyle w:val="Heading3"/>
       </w:pPr>
       <w:r>
-        <w:t>Lab 02: Draft a Project Brief in Word from Excel Evidence · Slides 36-37</w:t>
+        <w:t>Lab 02: Draft a Project Brief in Word from Excel Evidence · Slides 35-36</w:t>
       </w:r>
     </w:p>
     <w:p>
@@ -2784,7 +2784,7 @@
         <w:pStyle w:val="Heading3"/>
       </w:pPr>
       <w:r>
-        <w:t>Lab 03: Refine a Responsible Copilot Use Policy in Word · Slides 38-39</w:t>
+        <w:t>Lab 03: Refine a Responsible Copilot Use Policy in Word · Slides 37-38</w:t>
       </w:r>
     </w:p>
     <w:p>
@@ -2797,7 +2797,7 @@
         <w:pStyle w:val="Heading3"/>
       </w:pPr>
       <w:r>
-        <w:t>Lab 04: Build a PowerPoint Story from Word and Excel · Slides 40-41</w:t>
+        <w:t>Lab 04: Build a PowerPoint Story from Word and Excel · Slides 39-40</w:t>
       </w:r>
     </w:p>
     <w:p>
@@ -2810,7 +2810,7 @@
         <w:pStyle w:val="Heading3"/>
       </w:pPr>
       <w:r>
-        <w:t>Lab 05: Enhance PowerPoint with Native Charts and Speaker Notes · Slides 42-43</w:t>
+        <w:t>Lab 05: Enhance PowerPoint with Native Charts and Speaker Notes · Slides 41-42</w:t>
       </w:r>
     </w:p>
     <w:p>
@@ -2823,7 +2823,7 @@
         <w:pStyle w:val="Heading2"/>
       </w:pPr>
       <w:r>
-        <w:t>Topic 02: Copilot for Excel: From Questions to Deep Analysis · Slides 45-67</w:t>
+        <w:t>Topic 02: Copilot for Excel: From Questions to Deep Analysis · Slides 44-66</w:t>
       </w:r>
     </w:p>
     <w:p>
@@ -2920,7 +2920,7 @@
         <w:pStyle w:val="Heading3"/>
       </w:pPr>
       <w:r>
-        <w:t>Lab 06: Build and Audit Excel Formulas with Copilot · Slides 61-62</w:t>
+        <w:t>Lab 06: Build and Audit Excel Formulas with Copilot · Slides 60-61</w:t>
       </w:r>
     </w:p>
     <w:p>
@@ -2933,7 +2933,7 @@
         <w:pStyle w:val="Heading3"/>
       </w:pPr>
       <w:r>
-        <w:t>Lab 07: Run Deep Descriptive and Diagnostic Analysis in Excel · Slides 63-64</w:t>
+        <w:t>Lab 07: Run Deep Descriptive and Diagnostic Analysis in Excel · Slides 62-63</w:t>
       </w:r>
     </w:p>
     <w:p>
@@ -2946,7 +2946,7 @@
         <w:pStyle w:val="Heading3"/>
       </w:pPr>
       <w:r>
-        <w:t>Lab 08: Forecast and Stress-Test a Campaign with Copilot · Slides 65-66</w:t>
+        <w:t>Lab 08: Forecast and Stress-Test a Campaign with Copilot · Slides 64-65</w:t>
       </w:r>
     </w:p>
     <w:p>
@@ -2959,7 +2959,7 @@
         <w:pStyle w:val="Heading2"/>
       </w:pPr>
       <w:r>
-        <w:t>Topic 03: Copilot for Outlook, Teams and Loop · Slides 69-91</w:t>
+        <w:t>Topic 03: Copilot for Outlook, Teams and Loop · Slides 68-90</w:t>
       </w:r>
     </w:p>
     <w:p>
@@ -3056,7 +3056,7 @@
         <w:pStyle w:val="Heading3"/>
       </w:pPr>
       <w:r>
-        <w:t>Lab 09: Triage an Outlook Inbox and Draft a Controlled Reply · Slides 85-86</w:t>
+        <w:t>Lab 09: Triage an Outlook Inbox and Draft a Controlled Reply · Slides 84-85</w:t>
       </w:r>
     </w:p>
     <w:p>
@@ -3069,7 +3069,7 @@
         <w:pStyle w:val="Heading3"/>
       </w:pPr>
       <w:r>
-        <w:t>Lab 10: Run an Action-Oriented Teams Meeting · Slides 87-88</w:t>
+        <w:t>Lab 10: Run an Action-Oriented Teams Meeting · Slides 86-87</w:t>
       </w:r>
     </w:p>
     <w:p>
@@ -3082,7 +3082,7 @@
         <w:pStyle w:val="Heading3"/>
       </w:pPr>
       <w:r>
-        <w:t>Lab 11: Build a Living Implementation and Training Plan in Loop · Slides 89-90</w:t>
+        <w:t>Lab 11: Build a Living Implementation and Training Plan in Loop · Slides 88-89</w:t>
       </w:r>
     </w:p>
     <w:p>
@@ -3095,7 +3095,7 @@
         <w:pStyle w:val="Heading2"/>
       </w:pPr>
       <w:r>
-        <w:t>Topic 04: Microsoft 365 Copilot Agents and Governed Pipelines · Slides 93-119</w:t>
+        <w:t>Topic 04: Microsoft 365 Copilot Agents and Governed Pipelines · Slides 92-118</w:t>
       </w:r>
     </w:p>
     <w:p>
@@ -3192,7 +3192,7 @@
         <w:pStyle w:val="Heading3"/>
       </w:pPr>
       <w:r>
-        <w:t>Lab 12: Design a Scoped Microsoft 365 Copilot Agent · Slides 109-110</w:t>
+        <w:t>Lab 12: Design a Scoped Microsoft 365 Copilot Agent · Slides 108-109</w:t>
       </w:r>
     </w:p>
     <w:p>
@@ -3205,7 +3205,7 @@
         <w:pStyle w:val="Heading3"/>
       </w:pPr>
       <w:r>
-        <w:t>Lab 13: Build an Intake and Routing Agent · Slides 111-112</w:t>
+        <w:t>Lab 13: Build an Intake and Routing Agent · Slides 110-111</w:t>
       </w:r>
     </w:p>
     <w:p>
@@ -3218,7 +3218,7 @@
         <w:pStyle w:val="Heading3"/>
       </w:pPr>
       <w:r>
-        <w:t>Lab 14: Connect an Agent to a Controlled Action · Slides 113-114</w:t>
+        <w:t>Lab 14: Connect an Agent to a Controlled Action · Slides 112-113</w:t>
       </w:r>
     </w:p>
     <w:p>
@@ -3231,7 +3231,7 @@
         <w:pStyle w:val="Heading3"/>
       </w:pPr>
       <w:r>
-        <w:t>Lab 15: Create an Analysis-to-Deck Agent Pipeline · Slides 115-116</w:t>
+        <w:t>Lab 15: Create an Analysis-to-Deck Agent Pipeline · Slides 114-115</w:t>
       </w:r>
     </w:p>
     <w:p>
@@ -3244,7 +3244,7 @@
         <w:pStyle w:val="Heading3"/>
       </w:pPr>
       <w:r>
-        <w:t>Lab 16: Operate a Governed End-to-End Copilot Pipeline · Slides 117-118</w:t>
+        <w:t>Lab 16: Operate a Governed End-to-End Copilot Pipeline · Slides 116-117</w:t>
       </w:r>
     </w:p>
     <w:p>
@@ -3593,7 +3593,7 @@
     </w:p>
     <w:p>
       <w:r>
-        <w:t>Extension slide range: 120–132. All other slide content is retained; the practice-exam page was removed.</w:t>
+        <w:t>Extension slide range: 119–131. All other slide content is retained; the practice-exam page was removed.</w:t>
       </w:r>
     </w:p>
     <w:sectPr>

</xml_diff>

<commit_message>
feat: v9.2 adds real Copilot interface screenshots across courseware
Add 10 screenshot slides with numbered explanations (deck now 232
slides): Excel chat pane, + grounding menu, model picker and
edit/plan/chat modes, Outlook Work/Web, Personalization, OneDrive
skills folder, Custom skills, Manage plugins & skills, the @ Skill
picker and All Agents. The same screens appear in the Learner Guide,
the lab README Screen Guides (Labs 1, 2, 3, 5, 6, 11) and the Lesson
Plan demonstrations. Lumina HR scenario, labs and timing unchanged.

Co-Authored-By: Claude Opus 5.5 <noreply@anthropic.com>
</commit_message>
<xml_diff>
--- a/courseware/LP-Enhance Work Productivity with Microsoft 365 Copilot.docx
+++ b/courseware/LP-Enhance Work Productivity with Microsoft 365 Copilot.docx
@@ -179,7 +179,7 @@
           <w:color w:val="1F6FEB"/>
           <w:sz w:val="24"/>
         </w:rPr>
-        <w:t>Version 9.1</w:t>
+        <w:t>Version 9.2</w:t>
       </w:r>
     </w:p>
     <w:p>
@@ -280,6 +280,64 @@
                 <w:sz w:val="19"/>
               </w:rPr>
               <w:t>Author</w:t>
+            </w:r>
+          </w:p>
+        </w:tc>
+      </w:tr>
+      <w:tr>
+        <w:tc>
+          <w:tcPr>
+            <w:tcW w:type="dxa" w:w="1152"/>
+          </w:tcPr>
+          <w:p>
+            <w:r/>
+            <w:r>
+              <w:rPr>
+                <w:sz w:val="19"/>
+              </w:rPr>
+              <w:t>9.2</w:t>
+            </w:r>
+          </w:p>
+        </w:tc>
+        <w:tc>
+          <w:tcPr>
+            <w:tcW w:type="dxa" w:w="1656"/>
+          </w:tcPr>
+          <w:p>
+            <w:r/>
+            <w:r>
+              <w:rPr>
+                <w:sz w:val="19"/>
+              </w:rPr>
+              <w:t>20 October 2026</w:t>
+            </w:r>
+          </w:p>
+        </w:tc>
+        <w:tc>
+          <w:tcPr>
+            <w:tcW w:type="dxa" w:w="4896"/>
+          </w:tcPr>
+          <w:p>
+            <w:r/>
+            <w:r>
+              <w:rPr>
+                <w:sz w:val="19"/>
+              </w:rPr>
+              <w:t>Added real Microsoft 365 Copilot interface screenshots with numbered explanations: the Excel chat pane, the + grounding menu, model picker and edit/plan/chat modes, Outlook Work/Web, Personalization, the OneDrive skills folder, Custom skills, Manage plugins &amp; skills, the @ Skill picker and All Agents. The same screens appear in the slides, Learner Guide and lab READMEs; Lesson Plan demonstrations name the walkthroughs. Lumina HR scenario, labs, timing and assessments unchanged.</w:t>
+            </w:r>
+          </w:p>
+        </w:tc>
+        <w:tc>
+          <w:tcPr>
+            <w:tcW w:type="dxa" w:w="1656"/>
+          </w:tcPr>
+          <w:p>
+            <w:r/>
+            <w:r>
+              <w:rPr>
+                <w:sz w:val="19"/>
+              </w:rPr>
+              <w:t>Tertiary Infotech Academy</w:t>
             </w:r>
           </w:p>
         </w:tc>
@@ -1390,7 +1448,7 @@
                 <w:b/>
                 <w:sz w:val="19"/>
               </w:rPr>
-              <w:t>Topic 1 concepts and demonstration</w:t>
+              <w:t>Topic 1 concepts and demonstration, with screen walkthrough: Excel Copilot pane, + grounding menu, model picker, edit/plan/chat modes and Outlook Work/Web</w:t>
             </w:r>
           </w:p>
         </w:tc>
@@ -1608,7 +1666,7 @@
                 <w:b/>
                 <w:sz w:val="19"/>
               </w:rPr>
-              <w:t>Topic 2 concepts and demonstrations</w:t>
+              <w:t>Topic 2 concepts and demonstrations, with screen walkthrough: Personalization, OneDrive skills folder, Custom skills, Manage plugins &amp; skills and the @ Skill picker</w:t>
             </w:r>
           </w:p>
         </w:tc>
@@ -2629,7 +2687,7 @@
                 <w:b/>
                 <w:sz w:val="19"/>
               </w:rPr>
-              <w:t>Topic 4 concepts and Agent Builder demonstration</w:t>
+              <w:t>Topic 4 concepts and Agent Builder demonstration, with screen walkthrough: ••• &gt; All Agents</w:t>
             </w:r>
           </w:p>
         </w:tc>

</xml_diff>

<commit_message>
feat: v9.3 removes Microsoft Loop and adds dashboard and Pareto visuals
LO4 now reads "Design a training plan for staff to use Microsoft
Copilot Studio"; Lab 14 tracks staff practice in an Excel staff
enablement tracker instead of Loop. Add worked Lumina HR slides for
"What Is a Pareto Chart?", "What Is an Interactive Dashboard?" and
an All vs Retail Sales filter comparison, rendered from real formula
workbooks; the same visuals are in the Learner Guide and labs.

Co-Authored-By: Claude Opus 5.5 <noreply@anthropic.com>
</commit_message>
<xml_diff>
--- a/courseware/LP-Enhance Work Productivity with Microsoft 365 Copilot.docx
+++ b/courseware/LP-Enhance Work Productivity with Microsoft 365 Copilot.docx
@@ -179,7 +179,7 @@
           <w:color w:val="1F6FEB"/>
           <w:sz w:val="24"/>
         </w:rPr>
-        <w:t>Version 9.2</w:t>
+        <w:t>Version 9.3</w:t>
       </w:r>
     </w:p>
     <w:p>
@@ -280,6 +280,64 @@
                 <w:sz w:val="19"/>
               </w:rPr>
               <w:t>Author</w:t>
+            </w:r>
+          </w:p>
+        </w:tc>
+      </w:tr>
+      <w:tr>
+        <w:tc>
+          <w:tcPr>
+            <w:tcW w:type="dxa" w:w="1152"/>
+          </w:tcPr>
+          <w:p>
+            <w:r/>
+            <w:r>
+              <w:rPr>
+                <w:sz w:val="19"/>
+              </w:rPr>
+              <w:t>9.3</w:t>
+            </w:r>
+          </w:p>
+        </w:tc>
+        <w:tc>
+          <w:tcPr>
+            <w:tcW w:type="dxa" w:w="1656"/>
+          </w:tcPr>
+          <w:p>
+            <w:r/>
+            <w:r>
+              <w:rPr>
+                <w:sz w:val="19"/>
+              </w:rPr>
+              <w:t>20 October 2026</w:t>
+            </w:r>
+          </w:p>
+        </w:tc>
+        <w:tc>
+          <w:tcPr>
+            <w:tcW w:type="dxa" w:w="4896"/>
+          </w:tcPr>
+          <w:p>
+            <w:r/>
+            <w:r>
+              <w:rPr>
+                <w:sz w:val="19"/>
+              </w:rPr>
+              <w:t>Removed Microsoft Loop: LO4 now reads "Design a training plan for staff to use Microsoft Copilot Studio" (to be revised in TPG), and Lab 14 staff enablement uses an Excel staff enablement tracker with the same columns. Added worked Lumina HR screenshots: an interactive HR service dashboard (filters, KPI tiles, finding titles, linked charts) shown at All and filtered to Retail Sales, and a Pareto chart of overdue backlog by request type. Removed the empty duplicate lab folders.</w:t>
+            </w:r>
+          </w:p>
+        </w:tc>
+        <w:tc>
+          <w:tcPr>
+            <w:tcW w:type="dxa" w:w="1656"/>
+          </w:tcPr>
+          <w:p>
+            <w:r/>
+            <w:r>
+              <w:rPr>
+                <w:sz w:val="19"/>
+              </w:rPr>
+              <w:t>Tertiary Infotech Academy</w:t>
             </w:r>
           </w:p>
         </w:tc>
@@ -1194,7 +1252,7 @@
         <w:rPr>
           <w:sz w:val="21"/>
         </w:rPr>
-        <w:t>LO4: Design a training plan for staff to use Microsoft Loop and Copilot Studio.</w:t>
+        <w:t>LO4: Design a training plan for staff to use Microsoft Copilot Studio.</w:t>
       </w:r>
     </w:p>
     <w:p>

</xml_diff>